<commit_message>
Writing kit: RoBERTa-large test, WASSA validity, AI-judge selection
- Add in-pipeline RoBERTa-large sensitivity result (no reply-quality gain)
  to 5.3, 5.4, 3.8, 5.2 adjustments, with references in 4.2 and 5.2.
- Add WASSA validity evidence (provenance + agreement with AI judges) to
  4.1.5 and 5.3; correct the wrong "trained on essays" caveat.
- Add AI-judge panel and selection rationale with citations to 4.1.5;
  replace the pending inter-judge agreement table with computed values.

Co-Authored-By: Claude Opus 5 <noreply@anthropic.com>
</commit_message>
<xml_diff>
--- a/writing/Chapter 2 - 2.1 Preliminaries/WRITING_GUIDE.docx
+++ b/writing/Chapter 2 - 2.1 Preliminaries/WRITING_GUIDE.docx
@@ -600,17 +600,27 @@
         <w:t>WASSA Empathy Classifier.</w:t>
       </w:r>
       <w:r>
-        <w:t xml:space="preserve"> The WASSA 2024 shared task on empathy detection </w:t>
+        <w:t xml:space="preserve"> WASSA is a long-running workshop on computational approaches to subjectivity, sentiment and social media analysis, held with ACL. Its 2024 shared task </w:t>
       </w:r>
       <w:r>
         <w:rPr>
           <w:b/>
           <w:color w:val="B03A00"/>
         </w:rPr>
-        <w:t>[[CITE: Giorgi et al., 2024, WASSA 2024 shared task]]</w:t>
+        <w:t>[[CITE: Findings of WASSA 2024 Shared Task on Empathy and Personality Detection in Interactions, ACL Anthology 2024.wassa-1.30]]</w:t>
       </w:r>
       <w:r>
-        <w:t xml:space="preserve"> produced models that predict an empathy score for a piece of text. We use a publicly released DeBERTa-based model from that task (</w:t>
+        <w:t xml:space="preserve"> included a track (CONV-Turn) on predicting third-party human ratings of empathy for individual turns of a conversation. We use a publicly released DeBERTa-based system from that track </w:t>
+      </w:r>
+      <w:r>
+        <w:rPr>
+          <w:b/>
+          <w:color w:val="B03A00"/>
+        </w:rPr>
+        <w:t>[[CITE: hyy33 at WASSA 2024, ACL Anthology 2024.wassa-1.39]]</w:t>
+      </w:r>
+      <w:r>
+        <w:t xml:space="preserve"> (</w:t>
       </w:r>
       <w:r>
         <w:rPr>

</xml_diff>